<commit_message>
fix(meeting-minutes): フォント Meiryo UI 統一 + docx デザイン改善 + Python 3.9 互換
- フォントを Yu Gothic UI から Meiryo UI に変更（テンプレート + 生成スクリプト）
- docx タイトルとメタ情報テーブルを分離（日時/場所/出席者/議事録作成の4行表）
- メタ情報・アクションまとめ・次回予定のテーブルにヘッダー背景色を適用
- アクションまとめを4列テーブル化（偶数行に交互背景色）
- Python 3.9 互換: str | None を Optional[str] に修正（全スクリプト）
- docx テンプレートを再生成

Co-Authored-By: Claude Opus 4.7 <noreply@anthropic.com>
</commit_message>
<xml_diff>
--- a/plugins/meeting-minutes/skills/minutes-docx/assets/template/minutes-template.docx
+++ b/plugins/meeting-minutes/skills/minutes-docx/assets/template/minutes-template.docx
@@ -375,8 +375,12 @@
     <w:name w:val="Normal"/>
     <w:qFormat/>
     <w:rsid w:val="00FC693F"/>
+    <w:pPr>
+      <w:spacing w:after="80" w:line="276" w:lineRule="auto"/>
+    </w:pPr>
     <w:rPr>
-      <w:rFonts w:ascii="Yu Gothic UI" w:hAnsi="Yu Gothic UI"/>
+      <w:rFonts w:ascii="Meiryo UI" w:hAnsi="Meiryo UI"/>
+      <w:color w:val="333333"/>
       <w:sz w:val="21"/>
     </w:rPr>
   </w:style>
@@ -435,14 +439,17 @@
     <w:pPr>
       <w:keepNext/>
       <w:keepLines/>
-      <w:spacing w:before="480" w:after="0"/>
+      <w:spacing w:before="240" w:after="80"/>
       <w:outlineLvl w:val="0"/>
+      <w:pBdr>
+        <w:bottom w:val="single" w:sz="8" w:space="2" w:color="1B3A5C"/>
+      </w:pBdr>
     </w:pPr>
     <w:rPr>
-      <w:rFonts w:asciiTheme="majorHAnsi" w:eastAsiaTheme="majorEastAsia" w:hAnsiTheme="majorHAnsi" w:cstheme="majorBidi" w:ascii="Yu Gothic UI" w:hAnsi="Yu Gothic UI"/>
+      <w:rFonts w:asciiTheme="majorHAnsi" w:eastAsiaTheme="majorEastAsia" w:hAnsiTheme="majorHAnsi" w:cstheme="majorBidi" w:ascii="Meiryo UI" w:hAnsi="Meiryo UI"/>
       <w:b/>
       <w:bCs/>
-      <w:color w:val="1A1A2E"/>
+      <w:color w:val="1B3A5C"/>
       <w:sz w:val="28"/>
       <w:szCs w:val="28"/>
     </w:rPr>
@@ -459,14 +466,14 @@
     <w:pPr>
       <w:keepNext/>
       <w:keepLines/>
-      <w:spacing w:before="200" w:after="0"/>
+      <w:spacing w:before="160" w:after="80"/>
       <w:outlineLvl w:val="1"/>
     </w:pPr>
     <w:rPr>
-      <w:rFonts w:asciiTheme="majorHAnsi" w:eastAsiaTheme="majorEastAsia" w:hAnsiTheme="majorHAnsi" w:cstheme="majorBidi" w:ascii="Yu Gothic UI" w:hAnsi="Yu Gothic UI"/>
+      <w:rFonts w:asciiTheme="majorHAnsi" w:eastAsiaTheme="majorEastAsia" w:hAnsiTheme="majorHAnsi" w:cstheme="majorBidi" w:ascii="Meiryo UI" w:hAnsi="Meiryo UI"/>
       <w:b/>
       <w:bCs/>
-      <w:color w:val="1A1A2E"/>
+      <w:color w:val="2C5F8A"/>
       <w:sz w:val="24"/>
       <w:szCs w:val="26"/>
     </w:rPr>
@@ -483,14 +490,15 @@
     <w:pPr>
       <w:keepNext/>
       <w:keepLines/>
-      <w:spacing w:before="200" w:after="0"/>
+      <w:spacing w:before="160" w:after="80"/>
       <w:outlineLvl w:val="2"/>
     </w:pPr>
     <w:rPr>
-      <w:rFonts w:asciiTheme="majorHAnsi" w:eastAsiaTheme="majorEastAsia" w:hAnsiTheme="majorHAnsi" w:cstheme="majorBidi"/>
+      <w:rFonts w:asciiTheme="majorHAnsi" w:eastAsiaTheme="majorEastAsia" w:hAnsiTheme="majorHAnsi" w:cstheme="majorBidi" w:ascii="Meiryo UI" w:hAnsi="Meiryo UI"/>
       <w:b/>
       <w:bCs/>
-      <w:color w:val="4F81BD" w:themeColor="accent1"/>
+      <w:color w:val="3D7EAA"/>
+      <w:sz w:val="21"/>
     </w:rPr>
   </w:style>
   <w:style w:type="paragraph" w:styleId="Heading4">
@@ -724,15 +732,16 @@
       <w:pBdr>
         <w:bottom w:val="single" w:sz="8" w:space="4" w:color="4F81BD" w:themeColor="accent1"/>
       </w:pBdr>
-      <w:spacing w:after="300" w:line="240" w:lineRule="auto"/>
+      <w:spacing w:after="120" w:line="240" w:lineRule="auto" w:before="0"/>
       <w:contextualSpacing/>
     </w:pPr>
     <w:rPr>
-      <w:rFonts w:asciiTheme="majorHAnsi" w:eastAsiaTheme="majorEastAsia" w:hAnsiTheme="majorHAnsi" w:cstheme="majorBidi" w:ascii="Yu Gothic UI" w:hAnsi="Yu Gothic UI"/>
-      <w:color w:val="1A1A2E"/>
+      <w:rFonts w:asciiTheme="majorHAnsi" w:eastAsiaTheme="majorEastAsia" w:hAnsiTheme="majorHAnsi" w:cstheme="majorBidi" w:ascii="Meiryo UI" w:hAnsi="Meiryo UI"/>
+      <w:b/>
+      <w:color w:val="1B3A5C"/>
       <w:spacing w:val="5"/>
       <w:kern w:val="28"/>
-      <w:sz w:val="36"/>
+      <w:sz w:val="40"/>
       <w:szCs w:val="52"/>
     </w:rPr>
   </w:style>
@@ -906,10 +915,12 @@
       <w:numPr>
         <w:numId w:val="1"/>
       </w:numPr>
+      <w:spacing w:after="40"/>
       <w:contextualSpacing/>
     </w:pPr>
     <w:rPr>
-      <w:rFonts w:ascii="Yu Gothic UI" w:hAnsi="Yu Gothic UI"/>
+      <w:rFonts w:ascii="Meiryo UI" w:hAnsi="Meiryo UI"/>
+      <w:color w:val="333333"/>
       <w:sz w:val="21"/>
     </w:rPr>
   </w:style>
@@ -949,10 +960,12 @@
       <w:numPr>
         <w:numId w:val="5"/>
       </w:numPr>
+      <w:spacing w:after="40"/>
       <w:contextualSpacing/>
     </w:pPr>
     <w:rPr>
-      <w:rFonts w:ascii="Yu Gothic UI" w:hAnsi="Yu Gothic UI"/>
+      <w:rFonts w:ascii="Meiryo UI" w:hAnsi="Meiryo UI"/>
+      <w:color w:val="333333"/>
       <w:sz w:val="21"/>
     </w:rPr>
   </w:style>

</xml_diff>